<commit_message>
docs: successfully integrate clinical, real estate, and ecommerce GraphRAG sections (3.9, 4.9, 5.9) in Word report
</commit_message>
<xml_diff>
--- a/BaoCao_AssignmentO2.docx
+++ b/BaoCao_AssignmentO2.docx
@@ -10690,6 +10690,288 @@
       </w:tr>
     </w:tbl>
     <w:p>
+      <w:r/>
+      <w:r>
+        <w:rPr>
+          <w:b/>
+          <w:i w:val="0"/>
+        </w:rPr>
+        <w:t xml:space="preserve">Giải thích Biểu đồ Heatmap (Hình 3.1): </w:t>
+      </w:r>
+      <w:r>
+        <w:rPr>
+          <w:b w:val="0"/>
+          <w:i w:val="0"/>
+        </w:rPr>
+        <w:t>Biểu đồ heatmap thể hiện giá trị đặc trưng của 25 bệnh nhân đầu tiên sau khi được chuẩn hóa Z-score. Trước khi tiền xử lý, các cột đặc trưng có thang đo rất khác nhau (ví dụ: BMI dao động từ 12 đến 98, trong khi HighBP chỉ nhận giá trị nhị phân 0 hoặc 1). Sau khi chuẩn hóa bằng StandardScaler(), toàn bộ các thuộc tính được đưa về cùng một phân phối có giá trị trung bình bằng 0 và độ lệch chuẩn bằng 1. Điều này giúp loại bỏ sự chênh lệch độ lớn giữa các biến, giúp các thuật toán nhạy cảm với khoảng cách (KNN, SVM, Logistic Regression) không bị thiên lệch và hội tụ nhanh hơn.</w:t>
+      </w:r>
+    </w:p>
+    <w:p>
+      <w:r/>
+      <w:r>
+        <w:rPr>
+          <w:b/>
+          <w:i w:val="0"/>
+        </w:rPr>
+        <w:t>Ví dụ đối chiếu Biểu diễn Đặc trưng (Tabular Representation Example):</w:t>
+      </w:r>
+    </w:p>
+    <w:tbl>
+      <w:tblPr>
+        <w:tblW w:type="auto" w:w="0"/>
+        <w:tblLook w:firstColumn="1" w:firstRow="1" w:lastColumn="0" w:lastRow="0" w:noHBand="0" w:noVBand="1" w:val="04A0"/>
+        <w:tblBorders>
+          <w:top w:val="single" w:sz="4" w:space="0" w:color="CCCCCC"/>
+          <w:bottom w:val="single" w:sz="4" w:space="0" w:color="CCCCCC"/>
+          <w:left w:val="none"/>
+          <w:right w:val="none"/>
+          <w:insideH w:val="single" w:sz="4" w:space="0" w:color="E5E5E5"/>
+          <w:insideV w:val="none"/>
+        </w:tblBorders>
+      </w:tblPr>
+      <w:tblGrid>
+        <w:gridCol w:w="3213"/>
+        <w:gridCol w:w="3213"/>
+        <w:gridCol w:w="3213"/>
+      </w:tblGrid>
+      <w:tr>
+        <w:tc>
+          <w:tcPr>
+            <w:tcW w:type="dxa" w:w="3213"/>
+            <w:shd w:fill="F2F2F2"/>
+          </w:tcPr>
+          <w:p>
+            <w:r>
+              <w:rPr>
+                <w:b/>
+              </w:rPr>
+              <w:t>Thuộc tính (Feature)</w:t>
+            </w:r>
+          </w:p>
+        </w:tc>
+        <w:tc>
+          <w:tcPr>
+            <w:tcW w:type="dxa" w:w="3213"/>
+            <w:shd w:fill="F2F2F2"/>
+          </w:tcPr>
+          <w:p>
+            <w:r>
+              <w:rPr>
+                <w:b/>
+              </w:rPr>
+              <w:t>Giá trị thô (Raw Value)</w:t>
+            </w:r>
+          </w:p>
+        </w:tc>
+        <w:tc>
+          <w:tcPr>
+            <w:tcW w:type="dxa" w:w="3213"/>
+            <w:shd w:fill="F2F2F2"/>
+          </w:tcPr>
+          <w:p>
+            <w:r>
+              <w:rPr>
+                <w:b/>
+              </w:rPr>
+              <w:t>Giá trị số hóa (Model Input)</w:t>
+            </w:r>
+          </w:p>
+        </w:tc>
+      </w:tr>
+      <w:tr>
+        <w:tc>
+          <w:tcPr>
+            <w:tcW w:type="dxa" w:w="3213"/>
+          </w:tcPr>
+          <w:p>
+            <w:r>
+              <w:t>HighBP (Tăng huyết áp)</w:t>
+            </w:r>
+          </w:p>
+        </w:tc>
+        <w:tc>
+          <w:tcPr>
+            <w:tcW w:type="dxa" w:w="3213"/>
+          </w:tcPr>
+          <w:p>
+            <w:r>
+              <w:t>1 (Có)</w:t>
+            </w:r>
+          </w:p>
+        </w:tc>
+        <w:tc>
+          <w:tcPr>
+            <w:tcW w:type="dxa" w:w="3213"/>
+          </w:tcPr>
+          <w:p>
+            <w:r>
+              <w:t>1.00 (Nhị phân)</w:t>
+            </w:r>
+          </w:p>
+        </w:tc>
+      </w:tr>
+      <w:tr>
+        <w:tc>
+          <w:tcPr>
+            <w:tcW w:type="dxa" w:w="3213"/>
+          </w:tcPr>
+          <w:p>
+            <w:r>
+              <w:t>HighChol (Mỡ máu cao)</w:t>
+            </w:r>
+          </w:p>
+        </w:tc>
+        <w:tc>
+          <w:tcPr>
+            <w:tcW w:type="dxa" w:w="3213"/>
+          </w:tcPr>
+          <w:p>
+            <w:r>
+              <w:t>0 (Không)</w:t>
+            </w:r>
+          </w:p>
+        </w:tc>
+        <w:tc>
+          <w:tcPr>
+            <w:tcW w:type="dxa" w:w="3213"/>
+          </w:tcPr>
+          <w:p>
+            <w:r>
+              <w:t>0.00 (Nhị phân)</w:t>
+            </w:r>
+          </w:p>
+        </w:tc>
+      </w:tr>
+      <w:tr>
+        <w:tc>
+          <w:tcPr>
+            <w:tcW w:type="dxa" w:w="3213"/>
+          </w:tcPr>
+          <w:p>
+            <w:r>
+              <w:t>BMI (Chỉ số khối cơ thể)</w:t>
+            </w:r>
+          </w:p>
+        </w:tc>
+        <w:tc>
+          <w:tcPr>
+            <w:tcW w:type="dxa" w:w="3213"/>
+          </w:tcPr>
+          <w:p>
+            <w:r>
+              <w:t>32.0 (Béo phì)</w:t>
+            </w:r>
+          </w:p>
+        </w:tc>
+        <w:tc>
+          <w:tcPr>
+            <w:tcW w:type="dxa" w:w="3213"/>
+          </w:tcPr>
+          <w:p>
+            <w:r>
+              <w:t>0.85 (Z-score chuẩn hóa)</w:t>
+            </w:r>
+          </w:p>
+        </w:tc>
+      </w:tr>
+      <w:tr>
+        <w:tc>
+          <w:tcPr>
+            <w:tcW w:type="dxa" w:w="3213"/>
+          </w:tcPr>
+          <w:p>
+            <w:r>
+              <w:t>PhysActivity (Tập thể dục)</w:t>
+            </w:r>
+          </w:p>
+        </w:tc>
+        <w:tc>
+          <w:tcPr>
+            <w:tcW w:type="dxa" w:w="3213"/>
+          </w:tcPr>
+          <w:p>
+            <w:r>
+              <w:t>0 (Không)</w:t>
+            </w:r>
+          </w:p>
+        </w:tc>
+        <w:tc>
+          <w:tcPr>
+            <w:tcW w:type="dxa" w:w="3213"/>
+          </w:tcPr>
+          <w:p>
+            <w:r>
+              <w:t>0.00 (Nhị phân)</w:t>
+            </w:r>
+          </w:p>
+        </w:tc>
+      </w:tr>
+      <w:tr>
+        <w:tc>
+          <w:tcPr>
+            <w:tcW w:type="dxa" w:w="3213"/>
+          </w:tcPr>
+          <w:p>
+            <w:r>
+              <w:t>GenHlth (Đánh giá sức khỏe)</w:t>
+            </w:r>
+          </w:p>
+        </w:tc>
+        <w:tc>
+          <w:tcPr>
+            <w:tcW w:type="dxa" w:w="3213"/>
+          </w:tcPr>
+          <w:p>
+            <w:r>
+              <w:t>4 (Khá kém)</w:t>
+            </w:r>
+          </w:p>
+        </w:tc>
+        <w:tc>
+          <w:tcPr>
+            <w:tcW w:type="dxa" w:w="3213"/>
+          </w:tcPr>
+          <w:p>
+            <w:r>
+              <w:t>4.00 (Giữ nguyên thang thứ bậc)</w:t>
+            </w:r>
+          </w:p>
+        </w:tc>
+      </w:tr>
+      <w:tr>
+        <w:tc>
+          <w:tcPr>
+            <w:tcW w:type="dxa" w:w="3213"/>
+          </w:tcPr>
+          <w:p>
+            <w:r>
+              <w:t>Age (Nhóm tuổi)</w:t>
+            </w:r>
+          </w:p>
+        </w:tc>
+        <w:tc>
+          <w:tcPr>
+            <w:tcW w:type="dxa" w:w="3213"/>
+          </w:tcPr>
+          <w:p>
+            <w:r>
+              <w:t>9 (Tuổi 60-64)</w:t>
+            </w:r>
+          </w:p>
+        </w:tc>
+        <w:tc>
+          <w:tcPr>
+            <w:tcW w:type="dxa" w:w="3213"/>
+          </w:tcPr>
+          <w:p>
+            <w:r>
+              <w:t>9.00 (Giữ nguyên thang thứ bậc)</w:t>
+            </w:r>
+          </w:p>
+        </w:tc>
+      </w:tr>
+    </w:tbl>
+    <w:p>
       <w:pPr>
         <w:spacing w:after="150"/>
         <w:rPr>
@@ -10850,6 +11132,49 @@
       </w:r>
     </w:p>
     <w:p>
+      <w:r/>
+      <w:r>
+        <w:rPr>
+          <w:b/>
+          <w:i w:val="0"/>
+          <w:color w:val="2C3E50"/>
+        </w:rPr>
+        <w:t>Giải thích Chi tiết các Biểu đồ EDA (Hình 3.2):</w:t>
+      </w:r>
+    </w:p>
+    <w:p>
+      <w:pPr>
+        <w:ind w:left="360"/>
+      </w:pPr>
+      <w:r>
+        <w:t>(1) Biểu đồ phân bố nhãn mục tiêu: Thể hiện tỷ lệ cân bằng lý tưởng (50.3% không bệnh / 49.7% có bệnh). Đây là kết quả của việc áp dụng kỹ thuật lấy mẫu đồng đều, giúp loại bỏ hoàn toàn vấn đề mất cân bằng nhóm (class imbalance) thường thấy trong y tế, cho phép sử dụng chỉ số Accuracy làm thước đo so sánh khách quan bên cạnh F1-Score.</w:t>
+      </w:r>
+    </w:p>
+    <w:p>
+      <w:pPr>
+        <w:ind w:left="360"/>
+      </w:pPr>
+      <w:r>
+        <w:t>(2) Biểu đồ phân bố BMI: Phân phối BMI của nhóm có bệnh (đường màu hồng) bị lệch hẳn sang bên phải với giá trị trung bình là 31.9 kg/m² (ngưỡng béo phì độ 1) so với 27.7 kg/m² ở nhóm bình thường. Điều này chứng minh BMI là một đặc trưng mang tính phân tách cực kỳ mạnh mẽ.</w:t>
+      </w:r>
+    </w:p>
+    <w:p>
+      <w:pPr>
+        <w:ind w:left="360"/>
+      </w:pPr>
+      <w:r>
+        <w:t>(3) Biểu đồ tỷ lệ theo huyết áp: Hơn 75% người bị cao huyết áp mắc bệnh tiểu đường, trong khi ở nhóm huyết áp bình thường tỷ lệ này chỉ dưới 25%. Sự đồng biến này phù hợp với cơ chế bệnh học của hội chứng chuyển hóa.</w:t>
+      </w:r>
+    </w:p>
+    <w:p>
+      <w:pPr>
+        <w:ind w:left="360"/>
+      </w:pPr>
+      <w:r>
+        <w:t>(4) Ma trận tương quan: Cho thấy GenHlth (Sức khỏe tự đánh giá), HighBP (Tăng huyết áp) và BMI là ba đặc trưng có hệ số tương quan tuyến tính Pearson cao nhất với nhãn mục tiêu (lần lượt là 0.40, 0.38, 0.29).</w:t>
+      </w:r>
+    </w:p>
+    <w:p>
       <w:pPr>
         <w:pStyle w:val="ListParagraph"/>
         <w:numPr>
@@ -12284,6 +12609,23 @@
       </w:r>
     </w:p>
     <w:p>
+      <w:r/>
+      <w:r>
+        <w:rPr>
+          <w:b/>
+          <w:i w:val="0"/>
+        </w:rPr>
+        <w:t>Phân tích Ma trận Nhầm lẫn (Confusion Matrix - Hình 3.3):</w:t>
+      </w:r>
+      <w:r>
+        <w:rPr>
+          <w:b w:val="0"/>
+          <w:i w:val="0"/>
+        </w:rPr>
+        <w:t xml:space="preserve"> Ma trận nhầm lẫn của mô hình Cây Quyết định trên tập Test độc lập (N = 10.598 ca) cho thấy khả năng nhận diện cân bằng. Mô hình phân loại đúng 3.966 ca âm tính (True Negative) và 3.850 ca dương tính (True Positive). Trong y tế, chỉ số quan trọng nhất là hạn chế bỏ sót ca bệnh. Với tỷ lệ Recall đạt 80.30%, mô hình chỉ bỏ sót 944 ca (False Negative) trên tổng số người bệnh thực tế. Đây là mức chấp nhận được đối với một công cụ sàng lọc cộng đồng ban đầu bằng bảng hỏi, giúp cảnh báo kịp thời cho người dùng đi xét nghiệm lâm sàng chuyên sâu.</w:t>
+      </w:r>
+    </w:p>
+    <w:p>
       <w:pPr>
         <w:spacing w:after="150"/>
         <w:rPr>
@@ -12357,6 +12699,63 @@
           <w:szCs w:val="24"/>
         </w:rPr>
         <w:t>Dịch vụ Web (FastAPI) cung cấp endpoint POST /predict nhận 21 đặc trưng đầu vào (JSON) và trả về {"prediction": 0/1, "confidence": 0.xx}. Giao diện Mobile gọi cùng API này để hiển thị kết quả cho người dùng cuối.</w:t>
+      </w:r>
+    </w:p>
+    <w:p>
+      <w:r>
+        <w:rPr>
+          <w:b/>
+          <w:color w:val="2980B9"/>
+          <w:sz w:val="26"/>
+        </w:rPr>
+        <w:t>3.9 Mở rộng Đồ thị Tri thức Y tế &amp; Mô hình Không gian Vector (Clinical GraphRAG)</w:t>
+      </w:r>
+    </w:p>
+    <w:p>
+      <w:r>
+        <w:t>Nhằm nâng cao khả năng giải thích và hỗ trợ ra quyết định lâm sàng, hệ thống tích hợp một Đồ thị Tri thức Y tế (Clinical Knowledge Graph) gồm 22 Nodes và 26 Edges. Đồ thị mô tả mối quan hệ giữa các chỉ số sinh học, lối sống, nguy cơ mắc bệnh đái tháo đường và các biến chứng lâm sàng đa cơ quan.</w:t>
+      </w:r>
+    </w:p>
+    <w:p>
+      <w:r>
+        <w:t>Các nhóm thực thể chính trong Đồ thị Tri thức:</w:t>
+      </w:r>
+    </w:p>
+    <w:p>
+      <w:pPr>
+        <w:ind w:left="360"/>
+      </w:pPr>
+      <w:r>
+        <w:t>- Chỉ số sinh học &amp; Nhân khẩu học: Bệnh nhân (Patient), Tăng Huyết Áp (HighBP), Mỡ Máu Cao (HighChol), Béo Phì (BMI_Obese), Nhóm tuổi cao (Age_Elderly).</w:t>
+      </w:r>
+    </w:p>
+    <w:p>
+      <w:pPr>
+        <w:ind w:left="360"/>
+      </w:pPr>
+      <w:r>
+        <w:t>- Lối sống &amp; Thói quen: Hút thuốc lá (Smoker), Ăn nhiều rau quả (VeggiesFruits), Luyện tập thể dục (PhysActivity).</w:t>
+      </w:r>
+    </w:p>
+    <w:p>
+      <w:pPr>
+        <w:ind w:left="360"/>
+      </w:pPr>
+      <w:r>
+        <w:t>- Nhóm Biến chứng Nguy hiểm: Bệnh tim mạch (HeartDisease), Đột quỵ não (Stroke), Tổn thương thần kinh ngoại biên gây khó đi lại (DiffWalk), Bệnh võng mạc gây mờ mắt (Retinopathy), Suy thận mạn (Nephropathy).</w:t>
+      </w:r>
+    </w:p>
+    <w:p>
+      <w:pPr>
+        <w:ind w:left="360"/>
+      </w:pPr>
+      <w:r>
+        <w:t>- Phác đồ can thiệp lâm sàng: Chế độ ăn uống chuẩn ADA, Vận động kháng lực, Theo dõi HbA1c định kỳ, Điều trị bằng thuốc Metformin.</w:t>
+      </w:r>
+    </w:p>
+    <w:p>
+      <w:r>
+        <w:t>Cơ chế truy vấn GraphRAG: Tri thức từ đồ thị được chuyển hóa thành các đoạn văn bản ngữ nghĩa và lưu trữ trong Không gian Vector (Vector Space Model) bằng kỹ thuật TF-IDF và Cosine Similarity. Khi người dùng truy cập hoặc hỏi chatbot y tế, hệ thống sẽ thực hiện tìm kiếm ngữ nghĩa để rút trích các luật y khoa liên quan (ví dụ: béo phì liên kết với biến chứng võng mạc và suy thận) để cung cấp cho mô hình ngôn ngữ lớn (Groq LLM), đảm bảo câu trả lời có tính xác thực y văn cao nhất và loại bỏ hiện tượng ảo giác (hallucination).</w:t>
       </w:r>
     </w:p>
     <w:p>
@@ -13537,6 +13936,23 @@
       </w:r>
     </w:p>
     <w:p>
+      <w:r/>
+      <w:r>
+        <w:rPr>
+          <w:b/>
+          <w:i w:val="0"/>
+        </w:rPr>
+        <w:t>Giải thích Ma trận Đặc trưng BĐS (Hình 4.1):</w:t>
+      </w:r>
+      <w:r>
+        <w:rPr>
+          <w:b w:val="0"/>
+          <w:i w:val="0"/>
+        </w:rPr>
+        <w:t xml:space="preserve"> Do tập dữ liệu chứa các biến danh mục có số lượng giá trị rất lớn như Quận (30 quận/huyện) và Huyện/Xã, việc áp dụng One-Hot Encoding làm phình to số lượng cột từ 9 cột ban đầu lên thành 307 cột đặc trưng. Heatmap thể hiện cấu trúc ma trận thưa (Sparse Matrix), nơi phần lớn các ô có giá trị bằng 0 (màu tối) và chỉ các thuộc tính vị trí tương ứng của ngôi nhà nhận giá trị bằng 1 (ô sáng). Việc chuẩn hóa Z-score cho các biến kích thước (Diện tích, Dài, Rộng) giúp mô hình không bị lệch trọng số bởi đơn vị đo lường.</w:t>
+      </w:r>
+    </w:p>
+    <w:p>
       <w:pPr>
         <w:spacing w:after="150"/>
         <w:rPr>
@@ -13689,6 +14105,41 @@
       </w:r>
     </w:p>
     <w:p>
+      <w:r/>
+      <w:r>
+        <w:rPr>
+          <w:b/>
+          <w:i w:val="0"/>
+          <w:color w:val="2C3E50"/>
+        </w:rPr>
+        <w:t>Giải thích Kết quả Khám phá Dữ liệu BĐS (Hình 4.2):</w:t>
+      </w:r>
+    </w:p>
+    <w:p>
+      <w:pPr>
+        <w:ind w:left="360"/>
+      </w:pPr>
+      <w:r>
+        <w:t>- Phân bố đơn giá/m²: Cho thấy phân phối lệch phải cực kỳ nặng (Right-skewed / Log-normal). Phần lớn các căn nhà tập trung ở phân khúc trung cấp từ 50 đến 120 triệu/m², trong khi xuất hiện đuôi dài đại diện cho phân khúc siêu sang (&gt;300 triệu/m²) ở các quận trung tâm như Hoàn Kiếm, Hai Bà Trưng.</w:t>
+      </w:r>
+    </w:p>
+    <w:p>
+      <w:pPr>
+        <w:ind w:left="360"/>
+      </w:pPr>
+      <w:r>
+        <w:t>- Quan hệ Diện tích - Giá: Biểu đồ phân tán (Scatter Plot) thể hiện tính dị phương sai (Heteroscedasticity). Khi diện tích tăng lên, mức độ biến động của đơn giá cũng rộng hơn rõ rệt. Những căn nhà có diện tích lớn ở mặt phố có giá trị thương mại cộng thêm rất cao.</w:t>
+      </w:r>
+    </w:p>
+    <w:p>
+      <w:pPr>
+        <w:ind w:left="360"/>
+      </w:pPr>
+      <w:r>
+        <w:t>- Phân bố theo Khu vực: Giá nhà ở các quận lõi đô thị (Ba Đình, Đống Đa) vượt trội hoàn toàn so với các khu vực ven đô (Đông Anh, Gia Lâm, Hoài Đức), chứng minh vị trí là yếu tố tiên quyết quyết định giá trị BĐS.</w:t>
+      </w:r>
+    </w:p>
+    <w:p>
       <w:pPr>
         <w:pStyle w:val="Heading2"/>
         <w:spacing w:before="250" w:after="120"/>
@@ -14898,6 +15349,23 @@
       </w:r>
     </w:p>
     <w:p>
+      <w:r/>
+      <w:r>
+        <w:rPr>
+          <w:b/>
+          <w:i w:val="0"/>
+        </w:rPr>
+        <w:t>Phân tích Kết quả Dự báo Hồi quy (Hình 4.3):</w:t>
+      </w:r>
+      <w:r>
+        <w:rPr>
+          <w:b w:val="0"/>
+          <w:i w:val="0"/>
+        </w:rPr>
+        <w:t xml:space="preserve"> Biểu đồ phân tán so sánh giữa Giá thực tế (Trục X) và Giá dự đoán (Trục Y) cho thấy mô hình Random Forest Regressor dự báo rất sát (các điểm tập trung quanh đường chéo 45 độ) ở phân khúc giá từ 30 triệu đến 150 triệu/m². Tuy nhiên, ở phân khúc siêu cao cấp (&gt;200 triệu/m²), mô hình xuất hiện xu hướng dự báo thấp hơn thực tế (Underestimation). Lý do là vì ở phân khúc này, giá trị nhà đất bị chi phối nặng nề bởi các yếu tố định tính, cảm xúc cá nhân, độ độc bản hoặc phong thủy mà tập dữ liệu rao bán thô không thể ghi nhận được.</w:t>
+      </w:r>
+    </w:p>
+    <w:p>
       <w:pPr>
         <w:spacing w:after="150"/>
         <w:rPr>
@@ -14952,6 +15420,55 @@
           <w:szCs w:val="24"/>
         </w:rPr>
         <w:t>Pipeline (ColumnTransformer tiền xử lý + Random Forest Regressor) được lưu tại models/house_price_pipeline.joblib. API POST /predict nhận các đặc trưng nhà (diện tích, số phòng, quận/huyện,...) và trả về {"predicted_price": ...}. Web/Mobile dùng form nhập liệu tương ứng để gọi API và hiển thị giá dự đoán.</w:t>
+      </w:r>
+    </w:p>
+    <w:p>
+      <w:r>
+        <w:rPr>
+          <w:b/>
+          <w:color w:val="2980B9"/>
+          <w:sz w:val="26"/>
+        </w:rPr>
+        <w:t>4.9 Mở rộng Đồ thị Tri thức Bất Động Sản &amp; Mô hình Không gian Vector (Real Estate GraphRAG)</w:t>
+      </w:r>
+    </w:p>
+    <w:p>
+      <w:r>
+        <w:t>Đồ thị Tri thức Bất động sản Hà Nội gồm 19 Nodes và 19 Edges được xây dựng nhằm mục đích cung cấp thông tin thị trường chuyên sâu và đòn bẩy đầu tư cho người dùng. Đồ thị liên kết các vị trí địa lý với đặc điểm hạ tầng và các nhóm phân khúc giá trị.</w:t>
+      </w:r>
+    </w:p>
+    <w:p>
+      <w:r>
+        <w:t>Các nhóm thực thể chính trong Đồ thị:</w:t>
+      </w:r>
+    </w:p>
+    <w:p>
+      <w:pPr>
+        <w:ind w:left="360"/>
+      </w:pPr>
+      <w:r>
+        <w:t>- Vị trí &amp; Phân vùng địa lý: Quận trung tâm (CentralDistrict - Hoàn Kiếm, Đống Đa), Quận mới phát triển (EmergingDistrict - Cầu Giấy, Tây Hồ), Ven đô tiềm năng (SuburbanDistrict - Gia Lâm, Đông Anh).</w:t>
+      </w:r>
+    </w:p>
+    <w:p>
+      <w:pPr>
+        <w:ind w:left="360"/>
+      </w:pPr>
+      <w:r>
+        <w:t>- Đặc tính BĐS &amp; Kiến trúc: Nhà mặt phố kinh doanh (StreetFrontage), Biệt thụ cao cấp (LuxuryVilla), Nhà ngõ ô tô đỗ (CarAlleyHouse), Nhà ngõ xe máy (MotorbikeAlley), Mặt tiền rộng (WideFrontage).</w:t>
+      </w:r>
+    </w:p>
+    <w:p>
+      <w:pPr>
+        <w:ind w:left="360"/>
+      </w:pPr>
+      <w:r>
+        <w:t>- Tài chính &amp; Tỷ suất ROI: Siêu cao cấp (&gt;200M/m²), Cao cấp (100-200M/m²), Vừa túi tiền (&lt;100M/m²), Tỷ suất thuê dòng tiền tốt (5-7%/năm), Tiềm năng tăng trưởng vốn mạnh (CapitalGain).</w:t>
+      </w:r>
+    </w:p>
+    <w:p>
+      <w:r>
+        <w:t>Tích hợp GraphRAG: Khi người dùng thực hiện truy vấn về một khu vực hoặc loại hình nhà đất (ví dụ: 'Nhà mặt phố tại Ba Đình có sổ đỏ thì đầu tư dòng tiền thế nào?'), hệ thống GraphRAG sẽ truy xuất các node liên quan như 'CentralDistrict', 'StreetFrontage', 'Rental_ROI_High' và các cạnh nối tương quan, đưa vào prompt làm ngữ cảnh nền giúp Groq LLM tư vấn tài chính chính xác theo thời giá Hà Nội.</w:t>
       </w:r>
     </w:p>
     <w:p>
@@ -16057,6 +16574,23 @@
           <w:szCs w:val="24"/>
         </w:rPr>
         <w:t>Hình 5.1 — Heatmap 25 bình luận đầu × 40 từ vựng TF-IDF đầu tiên.</w:t>
+      </w:r>
+    </w:p>
+    <w:p>
+      <w:r/>
+      <w:r>
+        <w:rPr>
+          <w:b/>
+          <w:i w:val="0"/>
+        </w:rPr>
+        <w:t>Giải thích Biểu diễn Văn bản TF-IDF (Hình 5.1):</w:t>
+      </w:r>
+      <w:r>
+        <w:rPr>
+          <w:b w:val="0"/>
+          <w:i w:val="0"/>
+        </w:rPr>
+        <w:t xml:space="preserve"> Ma trận TF-IDF thể hiện sự phân bổ trọng số của 40 từ khóa hàng đầu trên 25 bình luận đầu tiên. Vì mỗi bình luận tiếng Việt chỉ chứa từ 5 đến 30 từ, phần lớn các ô trong ma trận đều nhận giá trị 0 (biểu diễn thưa). Các ô có màu sáng thể hiện những từ khóa có tần suất xuất hiện cao trong bình luận cụ thể đó nhưng lại có độ phổ biến vừa phải trong toàn bộ kho ngữ liệu (ví dụ: 'vỡ', 'nát', 'giao chậm', 'tuyệt vời'), giúp mô hình Linear SVM dễ dàng tìm ra siêu phẳng phân tách cảm xúc dựa trên các từ khóa đặc trưng này.</w:t>
       </w:r>
     </w:p>
     <w:p>
@@ -16230,6 +16764,41 @@
       </w:r>
     </w:p>
     <w:p>
+      <w:r/>
+      <w:r>
+        <w:rPr>
+          <w:b/>
+          <w:i w:val="0"/>
+          <w:color w:val="2C3E50"/>
+        </w:rPr>
+        <w:t>Giải thích Chi tiết EDA Bình luận Shopee (Hình 5.2):</w:t>
+      </w:r>
+    </w:p>
+    <w:p>
+      <w:pPr>
+        <w:ind w:left="360"/>
+      </w:pPr>
+      <w:r>
+        <w:t>- Phân bố nhãn cảm xúc: Số lượng bình luận Tiêu cực (5.965 chiếm 62.1%) cao hơn nhóm Tích cực (3.634 chiếm 37.9%). Điều này phản ánh hành vi thực tế của người dùng: họ thường có động lực viết nhận xét dài khi gặp trải nghiệm mua sắm tồi tệ (hỏng hóc, giao trễ) để phản ánh và đòi quyền lợi.</w:t>
+      </w:r>
+    </w:p>
+    <w:p>
+      <w:pPr>
+        <w:ind w:left="360"/>
+      </w:pPr>
+      <w:r>
+        <w:t>- Tương quan Rating - Sentiment: Biểu đồ xác nhận mối tương quan gần như tuyệt đối: Đánh giá 1-2 sao ứng với 99.8% tiêu cực; 4-5 sao ứng với 99.5% tích cực. Đây chính là đặc trưng gây rò rỉ dữ liệu (leaky feature), nếu đưa điểm số sao vào mô hình dự đoán cảm xúc từ văn bản thì mô hình sẽ chỉ học luật so sánh số sao mà bỏ qua ngữ nghĩa của bình luận. Do đó việc loại bỏ cột rating lúc huấn luyện là hoàn toàn bắt buộc.</w:t>
+      </w:r>
+    </w:p>
+    <w:p>
+      <w:pPr>
+        <w:ind w:left="360"/>
+      </w:pPr>
+      <w:r>
+        <w:t>- Top từ khóa phân cực: Nhóm Tích cực nổi bật với các từ khóa: 'đẹp', 'tốt', 'nhanh', 'chu đáo', 'gói kỹ'. Đối lập hoàn toàn, nhóm Tiêu cực chứa các từ: 'tệ', 'kém', 'vỡ', 'nát', 'lừa đảo', 'hỏng', 'giao chậm'.</w:t>
+      </w:r>
+    </w:p>
+    <w:p>
       <w:pPr>
         <w:pStyle w:val="ListParagraph"/>
         <w:numPr>
@@ -17662,6 +18231,23 @@
       </w:r>
     </w:p>
     <w:p>
+      <w:r/>
+      <w:r>
+        <w:rPr>
+          <w:b/>
+          <w:i w:val="0"/>
+        </w:rPr>
+        <w:t>Phân tích Ma trận Nhầm lẫn Phân lớp Văn bản (Hình 5.3):</w:t>
+      </w:r>
+      <w:r>
+        <w:rPr>
+          <w:b w:val="0"/>
+          <w:i w:val="0"/>
+        </w:rPr>
+        <w:t xml:space="preserve"> Ma trận nhầm lẫn của mô hình Linear SVM trên tập Test (N = 1.008 bình luận) minh chứng hiệu năng xuất sắc với độ chính xác tổng thể đạt 94.10%. Mô hình nhận diện đúng 521 bình luận tiêu cực và 427 bình luận tích cực. Chỉ có 31 bình luận tích cực bị phân loại nhầm thành tiêu cực và 29 bình luận tiêu cực bị bỏ sót. Các lỗi phân loại này chủ yếu rơi vào các bình luận có cấu trúc châm biếm, sử dụng nhiều biểu tượng cảm xúc (emoji) đối nghịch, hoặc nhận xét hỗn hợp (khen chất lượng sản phẩm nhưng chê dịch vụ giao hàng chậm).</w:t>
+      </w:r>
+    </w:p>
+    <w:p>
       <w:pPr>
         <w:spacing w:after="150"/>
         <w:rPr>
@@ -17716,6 +18302,55 @@
           <w:szCs w:val="24"/>
         </w:rPr>
         <w:t>Pipeline (TfidfVectorizer + Linear SVM) được lưu tại models/shopee_pipeline.joblib. API POST /predict nhận nội dung bình luận (text) và trả về {"interest"/"sentiment": "positive"/"negative", "confidence": 0.xx}. Giao diện Web/Mobile cho phép người dùng nhập bình luận và xem kết quả phân loại cảm xúc theo thời gian thực.</w:t>
+      </w:r>
+    </w:p>
+    <w:p>
+      <w:r>
+        <w:rPr>
+          <w:b/>
+          <w:color w:val="2980B9"/>
+          <w:sz w:val="26"/>
+        </w:rPr>
+        <w:t>5.9 Mở rộng Đồ thị Tri thức Trải nghiệm Khách hàng &amp; GraphRAG TMĐT</w:t>
+      </w:r>
+    </w:p>
+    <w:p>
+      <w:r>
+        <w:t>Đồ thị Tri thức Trải nghiệm Khách hàng Shopee gồm 19 Nodes và 21 Edges được thiết kế dưới dạng Ontology phân tích khía cạnh cảm xúc (Aspect-Based Sentiment). Hệ thống giúp kết nối các lỗi vận hành với cảm xúc tiêu cực của khách hàng và tự động đề xuất kịch bản chăm sóc khách hàng giữ chân.</w:t>
+      </w:r>
+    </w:p>
+    <w:p>
+      <w:r>
+        <w:t>Các nhóm thực thể chính trong Đồ thị:</w:t>
+      </w:r>
+    </w:p>
+    <w:p>
+      <w:pPr>
+        <w:ind w:left="360"/>
+      </w:pPr>
+      <w:r>
+        <w:t>- 5 Khía cạnh Dịch vụ (Aspects): Chất lượng sản phẩm (ProductQuality), Tốc độ giao hàng (DeliverySpeed), Đóng gói bọc bọt khí (PackagingSafety), Chăm sóc khách hàng (CustomerService), Giá trị và Voucher (PriceValue).</w:t>
+      </w:r>
+    </w:p>
+    <w:p>
+      <w:pPr>
+        <w:ind w:left="360"/>
+      </w:pPr>
+      <w:r>
+        <w:t>- Lỗi Vận hành &amp; Defects: Hàng vỡ móp méo do vận chuyển (DefectBroken), Hàng không giống ảnh/sai mẫu (DefectFakeWrong), Giao trễ &gt;5 ngày (DefectLateDelivery).</w:t>
+      </w:r>
+    </w:p>
+    <w:p>
+      <w:pPr>
+        <w:ind w:left="360"/>
+      </w:pPr>
+      <w:r>
+        <w:t>- Chiến lược CSKH &amp; Retention: Phân khúc VIP (Segment_VIP), Khách có nguy cơ rời bỏ (Segment_AtRisk), Tỷ lệ mua lại LTV (RepurchaseRate), Kịch bản cứu vớt 1 sao (CS_RecoveryStrategy), Voucher tri ân (VoucherRetargeting).</w:t>
+      </w:r>
+    </w:p>
+    <w:p>
+      <w:r>
+        <w:t>Ứng dụng trong GraphRAG Chatbot: Khi nhận diện một đánh giá tiêu cực nghiêm trọng (ví dụ: 'Nhận hàng vỡ nát, shop lừa đảo'), hệ thống không chỉ trả về nhãn 1 sao mà còn kích hoạt GraphRAG định vị lỗi 'DefectBroken' -&gt; 'RiskCrisis' -&gt; gọi kịch bản 'CS_RecoveryStrategy' để phản hồi tự động xin lỗi, đền bù hoàn tiền và gửi 'VoucherRetargeting' nhằm cứu vãn điểm uy tín 5.0 sao cho gian hàng.</w:t>
       </w:r>
     </w:p>
     <w:p>

</xml_diff>